<commit_message>
Restructured Rock Weathering Files
1) To add RW as a CDR Technology, exogenous files are present in energy/A63.
2) Weathering.xml is to be read after a dac_ssp{x}.xml file.
3) Currently, very low shareweight (0.05) has been given to the subsector DAC (by changing it in A62.subsector_shrwt.csv.
4) You also need to include a CO2 constraint file to see sequestration occurring from RW.
</commit_message>
<xml_diff>
--- a/Restructuring Docs/2. Changes to R code.docx
+++ b/Restructuring Docs/2. Changes to R code.docx
@@ -640,38 +640,6 @@
       </w:r>
       <w:bookmarkStart w:id="0" w:name="_GoBack"/>
       <w:bookmarkEnd w:id="0"/>
-    </w:p>
-    <w:p>
-      <w:pPr>
-        <w:pStyle w:val="ListParagraph"/>
-        <w:numPr>
-          <w:ilvl w:val="0"/>
-          <w:numId w:val="3"/>
-        </w:numPr>
-        <w:jc w:val="both"/>
-      </w:pPr>
-      <w:r>
-        <w:t xml:space="preserve">Changed </w:t>
-      </w:r>
-      <w:proofErr w:type="spellStart"/>
-      <w:r>
-        <w:t>nonenergyCseq</w:t>
-      </w:r>
-      <w:proofErr w:type="spellEnd"/>
-      <w:r>
-        <w:t xml:space="preserve"> to </w:t>
-      </w:r>
-      <w:r>
-        <w:t>onshore surface storage</w:t>
-      </w:r>
-      <w:r>
-        <w:t xml:space="preserve"> instead of CO2 removal. </w:t>
-      </w:r>
-    </w:p>
-    <w:p>
-      <w:r>
-        <w:t xml:space="preserve"> </w:t>
-      </w:r>
     </w:p>
     <w:sectPr>
       <w:pgSz w:w="11906" w:h="16838"/>

</xml_diff>